<commit_message>
add files for stage02
</commit_message>
<xml_diff>
--- a/project-personal/stage02/report/infosec-intro-project-personal-stage02-report.docx
+++ b/project-personal/stage02/report/infosec-intro-project-personal-stage02-report.docx
@@ -210,7 +210,7 @@
       </w:r>
     </w:p>
     <w:bookmarkEnd w:id="22"/>
-    <w:bookmarkStart w:id="70" w:name="выполнение-лабораторной-работы"/>
+    <w:bookmarkStart w:id="71" w:name="выполнение-лабораторной-работы"/>
     <w:p>
       <w:pPr>
         <w:pStyle w:val="Heading1"/>
@@ -619,20 +619,110 @@
       <w:r>
         <w:drawing>
           <wp:inline>
-            <wp:extent cx="3733800" cy="1336718"/>
+            <wp:extent cx="3733800" cy="2454290"/>
             <wp:effectExtent b="0" l="0" r="0" t="0"/>
             <wp:docPr descr="Авторизация в базе данных и предоставление привилегий" title="" id="40" name="Picture"/>
             <a:graphic>
               <a:graphicData uri="http://schemas.openxmlformats.org/drawingml/2006/picture">
                 <pic:pic>
                   <pic:nvPicPr>
-                    <pic:cNvPr descr="image/6.png" id="41" name="Picture"/>
+                    <pic:cNvPr descr="image/5.png" id="41" name="Picture"/>
                     <pic:cNvPicPr>
                       <a:picLocks noChangeArrowheads="1" noChangeAspect="1"/>
                     </pic:cNvPicPr>
                   </pic:nvPicPr>
                   <pic:blipFill>
                     <a:blip r:embed="rId39"/>
+                    <a:stretch>
+                      <a:fillRect/>
+                    </a:stretch>
+                  </pic:blipFill>
+                  <pic:spPr bwMode="auto">
+                    <a:xfrm>
+                      <a:off x="0" y="0"/>
+                      <a:ext cx="3733800" cy="2454290"/>
+                    </a:xfrm>
+                    <a:prstGeom prst="rect">
+                      <a:avLst/>
+                    </a:prstGeom>
+                    <a:noFill/>
+                    <a:ln w="9525">
+                      <a:noFill/>
+                      <a:headEnd/>
+                      <a:tailEnd/>
+                    </a:ln>
+                  </pic:spPr>
+                </pic:pic>
+              </a:graphicData>
+            </a:graphic>
+          </wp:inline>
+        </w:drawing>
+      </w:r>
+    </w:p>
+    <w:p>
+      <w:pPr>
+        <w:pStyle w:val="ImageCaption"/>
+      </w:pPr>
+      <w:r>
+        <w:t xml:space="preserve">Авторизация в базе данных и предоставление привилегий</w:t>
+      </w:r>
+    </w:p>
+    <w:bookmarkEnd w:id="42"/>
+    <w:p>
+      <w:pPr>
+        <w:pStyle w:val="BodyText"/>
+      </w:pPr>
+      <w:r>
+        <w:t xml:space="preserve">Необходимо настроить сервер apache2, перехожу в соответствующую директорию (</w:t>
+      </w:r>
+      <w:r>
+        <w:rPr>
+          <w:b/>
+          <w:bCs/>
+        </w:rPr>
+        <w:t xml:space="preserve">?@fig-006</w:t>
+      </w:r>
+      <w:r>
+        <w:t xml:space="preserve">). В файле</w:t>
+      </w:r>
+      <w:r>
+        <w:t xml:space="preserve"> </w:t>
+      </w:r>
+      <w:r>
+        <w:rPr>
+          <w:rStyle w:val="VerbatimChar"/>
+        </w:rPr>
+        <w:t xml:space="preserve">php.ini</w:t>
+      </w:r>
+      <w:r>
+        <w:t xml:space="preserve"> </w:t>
+      </w:r>
+      <w:r>
+        <w:t xml:space="preserve">нужно будет изменить один параметр, поэтому открываю файл в текстовом редакторе.</w:t>
+      </w:r>
+    </w:p>
+    <w:bookmarkStart w:id="46" w:name="fig:006"/>
+    <w:p>
+      <w:pPr>
+        <w:pStyle w:val="CaptionedFigure"/>
+      </w:pPr>
+      <w:r>
+        <w:drawing>
+          <wp:inline>
+            <wp:extent cx="3733800" cy="1336718"/>
+            <wp:effectExtent b="0" l="0" r="0" t="0"/>
+            <wp:docPr descr="Перемещение между директориями" title="" id="44" name="Picture"/>
+            <a:graphic>
+              <a:graphicData uri="http://schemas.openxmlformats.org/drawingml/2006/picture">
+                <pic:pic>
+                  <pic:nvPicPr>
+                    <pic:cNvPr descr="image/6.png" id="45" name="Picture"/>
+                    <pic:cNvPicPr>
+                      <a:picLocks noChangeArrowheads="1" noChangeAspect="1"/>
+                    </pic:cNvPicPr>
+                  </pic:nvPicPr>
+                  <pic:blipFill>
+                    <a:blip r:embed="rId43"/>
                     <a:stretch>
                       <a:fillRect/>
                     </a:stretch>
@@ -664,44 +754,44 @@
         <w:pStyle w:val="ImageCaption"/>
       </w:pPr>
       <w:r>
-        <w:t xml:space="preserve">Авторизация в базе данных и предоставление привилегий</w:t>
-      </w:r>
-    </w:p>
-    <w:bookmarkEnd w:id="42"/>
+        <w:t xml:space="preserve">Перемещение между директориями</w:t>
+      </w:r>
+    </w:p>
+    <w:bookmarkEnd w:id="46"/>
     <w:p>
       <w:pPr>
         <w:pStyle w:val="BodyText"/>
       </w:pPr>
       <w:r>
-        <w:t xml:space="preserve">Необходимо настроить сервер apache2, перехожу в соответствующую директорию (</w:t>
+        <w:t xml:space="preserve">В файле параметры allow_url_fopen и allow_url_include должны быть поставлены как</w:t>
+      </w:r>
+      <w:r>
+        <w:t xml:space="preserve"> </w:t>
+      </w:r>
+      <w:r>
+        <w:rPr>
+          <w:rStyle w:val="VerbatimChar"/>
+        </w:rPr>
+        <w:t xml:space="preserve">On</w:t>
+      </w:r>
+      <w:r>
+        <w:t xml:space="preserve"> </w:t>
+      </w:r>
+      <w:r>
+        <w:t xml:space="preserve">(</w:t>
       </w:r>
       <w:r>
         <w:rPr>
           <w:b/>
           <w:bCs/>
         </w:rPr>
-        <w:t xml:space="preserve">?@fig-006</w:t>
-      </w:r>
-      <w:r>
-        <w:t xml:space="preserve">). В файле</w:t>
-      </w:r>
-      <w:r>
-        <w:t xml:space="preserve"> </w:t>
-      </w:r>
-      <w:r>
-        <w:rPr>
-          <w:rStyle w:val="VerbatimChar"/>
-        </w:rPr>
-        <w:t xml:space="preserve">php.ini</w:t>
-      </w:r>
-      <w:r>
-        <w:t xml:space="preserve"> </w:t>
-      </w:r>
-      <w:r>
-        <w:t xml:space="preserve">нужно будет изменить один параметр, поэтому открываю файл в текстовом редакторе.</w:t>
-      </w:r>
-    </w:p>
-    <w:bookmarkStart w:id="45" w:name="fig:006"/>
+        <w:t xml:space="preserve">?@fig-007</w:t>
+      </w:r>
+      <w:r>
+        <w:t xml:space="preserve">).</w:t>
+      </w:r>
+    </w:p>
+    <w:bookmarkStart w:id="50" w:name="fig:007"/>
     <w:p>
       <w:pPr>
         <w:pStyle w:val="CaptionedFigure"/>
@@ -709,110 +799,20 @@
       <w:r>
         <w:drawing>
           <wp:inline>
-            <wp:extent cx="3733800" cy="1336718"/>
+            <wp:extent cx="3733800" cy="2474701"/>
             <wp:effectExtent b="0" l="0" r="0" t="0"/>
-            <wp:docPr descr="Перемещение между директориями" title="" id="43" name="Picture"/>
+            <wp:docPr descr="Редактирование файла" title="" id="48" name="Picture"/>
             <a:graphic>
               <a:graphicData uri="http://schemas.openxmlformats.org/drawingml/2006/picture">
                 <pic:pic>
                   <pic:nvPicPr>
-                    <pic:cNvPr descr="image/6.png" id="44" name="Picture"/>
+                    <pic:cNvPr descr="image/7.png" id="49" name="Picture"/>
                     <pic:cNvPicPr>
                       <a:picLocks noChangeArrowheads="1" noChangeAspect="1"/>
                     </pic:cNvPicPr>
                   </pic:nvPicPr>
                   <pic:blipFill>
-                    <a:blip r:embed="rId39"/>
-                    <a:stretch>
-                      <a:fillRect/>
-                    </a:stretch>
-                  </pic:blipFill>
-                  <pic:spPr bwMode="auto">
-                    <a:xfrm>
-                      <a:off x="0" y="0"/>
-                      <a:ext cx="3733800" cy="1336718"/>
-                    </a:xfrm>
-                    <a:prstGeom prst="rect">
-                      <a:avLst/>
-                    </a:prstGeom>
-                    <a:noFill/>
-                    <a:ln w="9525">
-                      <a:noFill/>
-                      <a:headEnd/>
-                      <a:tailEnd/>
-                    </a:ln>
-                  </pic:spPr>
-                </pic:pic>
-              </a:graphicData>
-            </a:graphic>
-          </wp:inline>
-        </w:drawing>
-      </w:r>
-    </w:p>
-    <w:p>
-      <w:pPr>
-        <w:pStyle w:val="ImageCaption"/>
-      </w:pPr>
-      <w:r>
-        <w:t xml:space="preserve">Перемещение между директориями</w:t>
-      </w:r>
-    </w:p>
-    <w:bookmarkEnd w:id="45"/>
-    <w:p>
-      <w:pPr>
-        <w:pStyle w:val="BodyText"/>
-      </w:pPr>
-      <w:r>
-        <w:t xml:space="preserve">В файле параметры allow_url_fopen и allow_url_include должны быть поставлены как</w:t>
-      </w:r>
-      <w:r>
-        <w:t xml:space="preserve"> </w:t>
-      </w:r>
-      <w:r>
-        <w:rPr>
-          <w:rStyle w:val="VerbatimChar"/>
-        </w:rPr>
-        <w:t xml:space="preserve">On</w:t>
-      </w:r>
-      <w:r>
-        <w:t xml:space="preserve"> </w:t>
-      </w:r>
-      <w:r>
-        <w:t xml:space="preserve">(</w:t>
-      </w:r>
-      <w:r>
-        <w:rPr>
-          <w:b/>
-          <w:bCs/>
-        </w:rPr>
-        <w:t xml:space="preserve">?@fig-007</w:t>
-      </w:r>
-      <w:r>
-        <w:t xml:space="preserve">).</w:t>
-      </w:r>
-    </w:p>
-    <w:bookmarkStart w:id="49" w:name="fig:007"/>
-    <w:p>
-      <w:pPr>
-        <w:pStyle w:val="CaptionedFigure"/>
-      </w:pPr>
-      <w:r>
-        <w:drawing>
-          <wp:inline>
-            <wp:extent cx="3733800" cy="2474701"/>
-            <wp:effectExtent b="0" l="0" r="0" t="0"/>
-            <wp:docPr descr="Редактирование файла" title="" id="47" name="Picture"/>
-            <a:graphic>
-              <a:graphicData uri="http://schemas.openxmlformats.org/drawingml/2006/picture">
-                <pic:pic>
-                  <pic:nvPicPr>
-                    <pic:cNvPr descr="image/7.png" id="48" name="Picture"/>
-                    <pic:cNvPicPr>
-                      <a:picLocks noChangeArrowheads="1" noChangeAspect="1"/>
-                    </pic:cNvPicPr>
-                  </pic:nvPicPr>
-                  <pic:blipFill>
-                    <a:blip r:embed="rId46"/>
+                    <a:blip r:embed="rId47"/>
                     <a:stretch>
                       <a:fillRect/>
                     </a:stretch>
@@ -847,7 +847,7 @@
         <w:t xml:space="preserve">Редактирование файла</w:t>
       </w:r>
     </w:p>
-    <w:bookmarkEnd w:id="49"/>
+    <w:bookmarkEnd w:id="50"/>
     <w:p>
       <w:pPr>
         <w:pStyle w:val="BodyText"/>
@@ -866,7 +866,7 @@
         <w:t xml:space="preserve">).</w:t>
       </w:r>
     </w:p>
-    <w:bookmarkStart w:id="53" w:name="fig:008"/>
+    <w:bookmarkStart w:id="54" w:name="fig:008"/>
     <w:p>
       <w:pPr>
         <w:pStyle w:val="CaptionedFigure"/>
@@ -876,18 +876,18 @@
           <wp:inline>
             <wp:extent cx="3733800" cy="1887157"/>
             <wp:effectExtent b="0" l="0" r="0" t="0"/>
-            <wp:docPr descr="Запуск службы" title="" id="51" name="Picture"/>
+            <wp:docPr descr="Запуск службы" title="" id="52" name="Picture"/>
             <a:graphic>
               <a:graphicData uri="http://schemas.openxmlformats.org/drawingml/2006/picture">
                 <pic:pic>
                   <pic:nvPicPr>
-                    <pic:cNvPr descr="image/8.png" id="52" name="Picture"/>
+                    <pic:cNvPr descr="image/8.png" id="53" name="Picture"/>
                     <pic:cNvPicPr>
                       <a:picLocks noChangeArrowheads="1" noChangeAspect="1"/>
                     </pic:cNvPicPr>
                   </pic:nvPicPr>
                   <pic:blipFill>
-                    <a:blip r:embed="rId50"/>
+                    <a:blip r:embed="rId51"/>
                     <a:stretch>
                       <a:fillRect/>
                     </a:stretch>
@@ -922,7 +922,7 @@
         <w:t xml:space="preserve">Запуск службы</w:t>
       </w:r>
     </w:p>
-    <w:bookmarkEnd w:id="53"/>
+    <w:bookmarkEnd w:id="54"/>
     <w:p>
       <w:pPr>
         <w:pStyle w:val="BodyText"/>
@@ -941,7 +941,7 @@
         <w:t xml:space="preserve">).</w:t>
       </w:r>
     </w:p>
-    <w:bookmarkStart w:id="57" w:name="fig:009"/>
+    <w:bookmarkStart w:id="58" w:name="fig:009"/>
     <w:p>
       <w:pPr>
         <w:pStyle w:val="CaptionedFigure"/>
@@ -951,18 +951,18 @@
           <wp:inline>
             <wp:extent cx="3733800" cy="3034804"/>
             <wp:effectExtent b="0" l="0" r="0" t="0"/>
-            <wp:docPr descr="Запуск веб-приложения" title="" id="55" name="Picture"/>
+            <wp:docPr descr="Запуск веб-приложения" title="" id="56" name="Picture"/>
             <a:graphic>
               <a:graphicData uri="http://schemas.openxmlformats.org/drawingml/2006/picture">
                 <pic:pic>
                   <pic:nvPicPr>
-                    <pic:cNvPr descr="image/9.png" id="56" name="Picture"/>
+                    <pic:cNvPr descr="image/9.png" id="57" name="Picture"/>
                     <pic:cNvPicPr>
                       <a:picLocks noChangeArrowheads="1" noChangeAspect="1"/>
                     </pic:cNvPicPr>
                   </pic:nvPicPr>
                   <pic:blipFill>
-                    <a:blip r:embed="rId54"/>
+                    <a:blip r:embed="rId55"/>
                     <a:stretch>
                       <a:fillRect/>
                     </a:stretch>
@@ -997,7 +997,7 @@
         <w:t xml:space="preserve">Запуск веб-приложения</w:t>
       </w:r>
     </w:p>
-    <w:bookmarkEnd w:id="57"/>
+    <w:bookmarkEnd w:id="58"/>
     <w:p>
       <w:pPr>
         <w:pStyle w:val="BodyText"/>
@@ -1031,7 +1031,7 @@
         <w:t xml:space="preserve">).</w:t>
       </w:r>
     </w:p>
-    <w:bookmarkStart w:id="61" w:name="fig:010"/>
+    <w:bookmarkStart w:id="62" w:name="fig:010"/>
     <w:p>
       <w:pPr>
         <w:pStyle w:val="CaptionedFigure"/>
@@ -1041,18 +1041,18 @@
           <wp:inline>
             <wp:extent cx="3733800" cy="3034804"/>
             <wp:effectExtent b="0" l="0" r="0" t="0"/>
-            <wp:docPr descr="“Создание базы данных”" title="" id="59" name="Picture"/>
+            <wp:docPr descr="“Создание базы данных”" title="" id="60" name="Picture"/>
             <a:graphic>
               <a:graphicData uri="http://schemas.openxmlformats.org/drawingml/2006/picture">
                 <pic:pic>
                   <pic:nvPicPr>
-                    <pic:cNvPr descr="image/10.png" id="60" name="Picture"/>
+                    <pic:cNvPr descr="image/10.png" id="61" name="Picture"/>
                     <pic:cNvPicPr>
                       <a:picLocks noChangeArrowheads="1" noChangeAspect="1"/>
                     </pic:cNvPicPr>
                   </pic:nvPicPr>
                   <pic:blipFill>
-                    <a:blip r:embed="rId58"/>
+                    <a:blip r:embed="rId59"/>
                     <a:stretch>
                       <a:fillRect/>
                     </a:stretch>
@@ -1087,7 +1087,7 @@
         <w:t xml:space="preserve">“Создание базы данных”</w:t>
       </w:r>
     </w:p>
-    <w:bookmarkEnd w:id="61"/>
+    <w:bookmarkEnd w:id="62"/>
     <w:p>
       <w:pPr>
         <w:pStyle w:val="BodyText"/>
@@ -1106,7 +1106,7 @@
         <w:t xml:space="preserve">).</w:t>
       </w:r>
     </w:p>
-    <w:bookmarkStart w:id="65" w:name="fig:011"/>
+    <w:bookmarkStart w:id="66" w:name="fig:011"/>
     <w:p>
       <w:pPr>
         <w:pStyle w:val="CaptionedFigure"/>
@@ -1116,18 +1116,18 @@
           <wp:inline>
             <wp:extent cx="3733800" cy="3034804"/>
             <wp:effectExtent b="0" l="0" r="0" t="0"/>
-            <wp:docPr descr="Авторизация" title="" id="63" name="Picture"/>
+            <wp:docPr descr="Авторизация" title="" id="64" name="Picture"/>
             <a:graphic>
               <a:graphicData uri="http://schemas.openxmlformats.org/drawingml/2006/picture">
                 <pic:pic>
                   <pic:nvPicPr>
-                    <pic:cNvPr descr="image/11.png" id="64" name="Picture"/>
+                    <pic:cNvPr descr="image/11.png" id="65" name="Picture"/>
                     <pic:cNvPicPr>
                       <a:picLocks noChangeArrowheads="1" noChangeAspect="1"/>
                     </pic:cNvPicPr>
                   </pic:nvPicPr>
                   <pic:blipFill>
-                    <a:blip r:embed="rId62"/>
+                    <a:blip r:embed="rId63"/>
                     <a:stretch>
                       <a:fillRect/>
                     </a:stretch>
@@ -1162,7 +1162,7 @@
         <w:t xml:space="preserve">Авторизация</w:t>
       </w:r>
     </w:p>
-    <w:bookmarkEnd w:id="65"/>
+    <w:bookmarkEnd w:id="66"/>
     <w:p>
       <w:pPr>
         <w:pStyle w:val="BodyText"/>
@@ -1181,7 +1181,7 @@
         <w:t xml:space="preserve">).</w:t>
       </w:r>
     </w:p>
-    <w:bookmarkStart w:id="69" w:name="fig:012"/>
+    <w:bookmarkStart w:id="70" w:name="fig:012"/>
     <w:p>
       <w:pPr>
         <w:pStyle w:val="CaptionedFigure"/>
@@ -1191,18 +1191,18 @@
           <wp:inline>
             <wp:extent cx="3733800" cy="3034804"/>
             <wp:effectExtent b="0" l="0" r="0" t="0"/>
-            <wp:docPr descr="Домашняя страница DVWA" title="" id="67" name="Picture"/>
+            <wp:docPr descr="Домашняя страница DVWA" title="" id="68" name="Picture"/>
             <a:graphic>
               <a:graphicData uri="http://schemas.openxmlformats.org/drawingml/2006/picture">
                 <pic:pic>
                   <pic:nvPicPr>
-                    <pic:cNvPr descr="image/12.png" id="68" name="Picture"/>
+                    <pic:cNvPr descr="image/12.png" id="69" name="Picture"/>
                     <pic:cNvPicPr>
                       <a:picLocks noChangeArrowheads="1" noChangeAspect="1"/>
                     </pic:cNvPicPr>
                   </pic:nvPicPr>
                   <pic:blipFill>
-                    <a:blip r:embed="rId66"/>
+                    <a:blip r:embed="rId67"/>
                     <a:stretch>
                       <a:fillRect/>
                     </a:stretch>
@@ -1237,9 +1237,9 @@
         <w:t xml:space="preserve">Домашняя страница DVWA</w:t>
       </w:r>
     </w:p>
-    <w:bookmarkEnd w:id="69"/>
     <w:bookmarkEnd w:id="70"/>
-    <w:bookmarkStart w:id="71" w:name="выводы"/>
+    <w:bookmarkEnd w:id="71"/>
+    <w:bookmarkStart w:id="72" w:name="выводы"/>
     <w:p>
       <w:pPr>
         <w:pStyle w:val="Heading1"/>
@@ -1256,8 +1256,8 @@
         <w:t xml:space="preserve">В ходе работы я приобрела практические навыки по установке уязвимого веб-приложения DVWA.</w:t>
       </w:r>
     </w:p>
-    <w:bookmarkEnd w:id="71"/>
-    <w:bookmarkStart w:id="73" w:name="список-литературы"/>
+    <w:bookmarkEnd w:id="72"/>
+    <w:bookmarkStart w:id="74" w:name="список-литературы"/>
     <w:p>
       <w:pPr>
         <w:pStyle w:val="Heading1"/>
@@ -1266,9 +1266,9 @@
         <w:t xml:space="preserve">Список литературы</w:t>
       </w:r>
     </w:p>
-    <w:bookmarkStart w:id="72" w:name="refs"/>
-    <w:bookmarkEnd w:id="72"/>
+    <w:bookmarkStart w:id="73" w:name="refs"/>
     <w:bookmarkEnd w:id="73"/>
+    <w:bookmarkEnd w:id="74"/>
     <w:sectPr>
       <w:footnotePr>
         <w:numRestart w:val="eachSect"/>

</xml_diff>